<commit_message>
Explorer: show the envelope as data, meta and references
- The detail pane always renders all three members, with a strip saying which
  are present. References are shown even when empty, with what a reference would
  contain, because an absent reference is information.
- A producer's own wrapper is unwrapped: the Data section shows the inner payload
  and names the topic and producer it was published under.
- Payload producers are authoritative, so model.fill now splits into grid, hft
  and movers in the flow: fifteen nodes across five stages.
- Fixed a duplicate const that had broken the served bundle, and clearing the
  selection now releases the journey key.
</commit_message>
<xml_diff>
--- a/docs/Envelope-Explorer-User-Guide.docx
+++ b/docs/Envelope-Explorer-User-Guide.docx
@@ -1553,7 +1553,7 @@
           <w:b w:val="0"/>
           <w:i w:val="0"/>
         </w:rPr>
-        <w:t>Click any row and the right-hand pane shows everything known about that message, in three parts.</w:t>
+        <w:t>An envelope has three members and the right-hand pane shows all three, always: data, meta and references. A strip at the top of the pane tells you at a glance which are present.</w:t>
       </w:r>
     </w:p>
     <w:p>
@@ -1561,7 +1561,230 @@
         <w:pStyle w:val="Heading2"/>
       </w:pPr>
       <w:r>
-        <w:t>4.1  Meta — provenance and freshness</w:t>
+        <w:t>4.1  The three members</w:t>
+      </w:r>
+    </w:p>
+    <w:tbl>
+      <w:tblPr>
+        <w:tblStyle w:val="LightGrid-Accent1"/>
+        <w:tblW w:type="auto" w:w="0"/>
+        <w:jc w:val="center"/>
+        <w:tblLook w:firstColumn="1" w:firstRow="1" w:lastColumn="0" w:lastRow="0" w:noHBand="0" w:noVBand="1" w:val="04A0"/>
+      </w:tblPr>
+      <w:tblGrid>
+        <w:gridCol w:w="3249"/>
+        <w:gridCol w:w="3249"/>
+        <w:gridCol w:w="3249"/>
+      </w:tblGrid>
+      <w:tr>
+        <w:tc>
+          <w:tcPr>
+            <w:tcW w:type="dxa" w:w="1152"/>
+          </w:tcPr>
+          <w:p>
+            <w:r/>
+            <w:r>
+              <w:rPr>
+                <w:b/>
+                <w:sz w:val="18"/>
+              </w:rPr>
+              <w:t>Member</w:t>
+            </w:r>
+          </w:p>
+        </w:tc>
+        <w:tc>
+          <w:tcPr>
+            <w:tcW w:type="dxa" w:w="4896"/>
+          </w:tcPr>
+          <w:p>
+            <w:r/>
+            <w:r>
+              <w:rPr>
+                <w:b/>
+                <w:sz w:val="18"/>
+              </w:rPr>
+              <w:t>What it carries</w:t>
+            </w:r>
+          </w:p>
+        </w:tc>
+        <w:tc>
+          <w:tcPr>
+            <w:tcW w:type="dxa" w:w="3456"/>
+          </w:tcPr>
+          <w:p>
+            <w:r/>
+            <w:r>
+              <w:rPr>
+                <w:b/>
+                <w:sz w:val="18"/>
+              </w:rPr>
+              <w:t>If it is missing</w:t>
+            </w:r>
+          </w:p>
+        </w:tc>
+      </w:tr>
+      <w:tr>
+        <w:tc>
+          <w:tcPr>
+            <w:tcW w:type="dxa" w:w="1152"/>
+          </w:tcPr>
+          <w:p>
+            <w:r/>
+            <w:r>
+              <w:rPr>
+                <w:sz w:val="17"/>
+              </w:rPr>
+              <w:t>data</w:t>
+            </w:r>
+          </w:p>
+        </w:tc>
+        <w:tc>
+          <w:tcPr>
+            <w:tcW w:type="dxa" w:w="4896"/>
+          </w:tcPr>
+          <w:p>
+            <w:r/>
+            <w:r>
+              <w:rPr>
+                <w:sz w:val="17"/>
+              </w:rPr>
+              <w:t>the payload for this topic</w:t>
+            </w:r>
+          </w:p>
+        </w:tc>
+        <w:tc>
+          <w:tcPr>
+            <w:tcW w:type="dxa" w:w="3456"/>
+          </w:tcPr>
+          <w:p>
+            <w:r/>
+            <w:r>
+              <w:rPr>
+                <w:sz w:val="17"/>
+              </w:rPr>
+              <w:t>never — a message with no data is refused</w:t>
+            </w:r>
+          </w:p>
+        </w:tc>
+      </w:tr>
+      <w:tr>
+        <w:tc>
+          <w:tcPr>
+            <w:tcW w:type="dxa" w:w="1152"/>
+          </w:tcPr>
+          <w:p>
+            <w:r/>
+            <w:r>
+              <w:rPr>
+                <w:sz w:val="17"/>
+              </w:rPr>
+              <w:t>meta</w:t>
+            </w:r>
+          </w:p>
+        </w:tc>
+        <w:tc>
+          <w:tcPr>
+            <w:tcW w:type="dxa" w:w="4896"/>
+          </w:tcPr>
+          <w:p>
+            <w:r/>
+            <w:r>
+              <w:rPr>
+                <w:sz w:val="17"/>
+              </w:rPr>
+              <w:t>version, plane, producer, generation, correlation id, computed_at, recorded_at, bytes</w:t>
+            </w:r>
+          </w:p>
+        </w:tc>
+        <w:tc>
+          <w:tcPr>
+            <w:tcW w:type="dxa" w:w="3456"/>
+          </w:tcPr>
+          <w:p>
+            <w:r/>
+            <w:r>
+              <w:rPr>
+                <w:sz w:val="17"/>
+              </w:rPr>
+              <w:t>the pane says 'inferred'</w:t>
+            </w:r>
+          </w:p>
+        </w:tc>
+      </w:tr>
+      <w:tr>
+        <w:tc>
+          <w:tcPr>
+            <w:tcW w:type="dxa" w:w="1152"/>
+          </w:tcPr>
+          <w:p>
+            <w:r/>
+            <w:r>
+              <w:rPr>
+                <w:sz w:val="17"/>
+              </w:rPr>
+              <w:t>refs</w:t>
+            </w:r>
+          </w:p>
+        </w:tc>
+        <w:tc>
+          <w:tcPr>
+            <w:tcW w:type="dxa" w:w="4896"/>
+          </w:tcPr>
+          <w:p>
+            <w:r/>
+            <w:r>
+              <w:rPr>
+                <w:sz w:val="17"/>
+              </w:rPr>
+              <w:t>topic, key, generation and correlation id of each input</w:t>
+            </w:r>
+          </w:p>
+        </w:tc>
+        <w:tc>
+          <w:tcPr>
+            <w:tcW w:type="dxa" w:w="3456"/>
+          </w:tcPr>
+          <w:p>
+            <w:r/>
+            <w:r>
+              <w:rPr>
+                <w:sz w:val="17"/>
+              </w:rPr>
+              <w:t>the pane says 'none' and explains what a reference would contain</w:t>
+            </w:r>
+          </w:p>
+        </w:tc>
+      </w:tr>
+    </w:tbl>
+    <w:p>
+      <w:pPr>
+        <w:spacing w:after="40"/>
+      </w:pPr>
+    </w:p>
+    <w:p>
+      <w:r>
+        <w:rPr>
+          <w:b w:val="0"/>
+          <w:i w:val="0"/>
+        </w:rPr>
+        <w:t>References are the member that is usually empty today: the Python books do not emit them yet, so the pane says 'none recorded' rather than hiding the section. That is deliberate — an absent reference is itself information, and it should be visible rather than implied.</w:t>
+      </w:r>
+    </w:p>
+    <w:p>
+      <w:r>
+        <w:rPr>
+          <w:b w:val="0"/>
+          <w:i w:val="0"/>
+        </w:rPr>
+        <w:t>When a producer publishes its own wrapper (the Python books do: topic, producer, data, version, seq), the pane unwraps it: the Data section shows the inner payload and names the topic and producer it was published under.</w:t>
+      </w:r>
+    </w:p>
+    <w:p>
+      <w:pPr>
+        <w:pStyle w:val="Heading2"/>
+      </w:pPr>
+      <w:r>
+        <w:t>4.2  Meta — provenance and freshness</w:t>
       </w:r>
     </w:p>
     <w:tbl>
@@ -1986,7 +2209,7 @@
         <w:pStyle w:val="Heading2"/>
       </w:pPr>
       <w:r>
-        <w:t>4.2  Data — the payload</w:t>
+        <w:t>4.3  Data — the payload</w:t>
       </w:r>
     </w:p>
     <w:p>
@@ -2053,7 +2276,7 @@
         <w:pStyle w:val="Heading2"/>
       </w:pPr>
       <w:r>
-        <w:t>4.3  Chain — what else happened for that symbol</w:t>
+        <w:t>4.4  Chain — what else happened for that symbol</w:t>
       </w:r>
     </w:p>
     <w:p>
@@ -2288,7 +2511,7 @@
           <w:color w:val="596370"/>
           <w:sz w:val="16"/>
         </w:rPr>
-        <w:t>Figure 4 — the whole platform as a flow: five stages, thirteen nodes, fourteen correlations. Box height is volume; ribbon width is how many correlations were observed.</w:t>
+        <w:t>Figure 4 — the whole platform as a flow: five stages and fifteen nodes, including each model that wrote a fill. Box height is volume; ribbon width is the number of correlations observed.</w:t>
       </w:r>
     </w:p>
     <w:p>
@@ -2455,7 +2678,7 @@
           <w:color w:val="596370"/>
           <w:sz w:val="16"/>
         </w:rPr>
-        <w:t>Figure 5 — the same diagram anchored on a decision envelope: the dashed ring marks where you came in, and the window runs forward from that moment.</w:t>
+        <w:t>Figure 5 — the same diagram anchored on a model.fill envelope: the dashed ring marks where you came in, and the window runs forward from that moment.</w:t>
       </w:r>
     </w:p>
     <w:p>
@@ -2504,6 +2727,14 @@
       </w:pPr>
       <w:r>
         <w:t>Colour is the plane: blue market, green intel, amber model, teal control, grey system.</w:t>
+      </w:r>
+    </w:p>
+    <w:p>
+      <w:pPr>
+        <w:pStyle w:val="ListBullet"/>
+      </w:pPr>
+      <w:r>
+        <w:t>Nodes are split by producer, so three models writing model.fill appear as three boxes, each labelled with its engine.</w:t>
       </w:r>
     </w:p>
     <w:p>

</xml_diff>

<commit_message>
Explorer: an execution trace for a model's decision
- /api/execution?id= returns the envelopes a fill could have read: the newest
  per topic before the anchor, plus outcomes after it, each with its age at the
  moment of execution.
- New EXECUTION tab: lanes by stage, nodes positioned in time, a dashed marker at
  the moment of execution, a dotted reading path, 1x/2x/4x zoom, horizontal
  scrolling that opens centred on the anchor, and a table of what was used.
- Clicking a node opens its raw envelope, so the trace is drillable to data, meta
  and references.
- Guide: new chapter 7 documents the trace; 18 pages, 10 screenshots.
</commit_message>
<xml_diff>
--- a/docs/Envelope-Explorer-User-Guide.docx
+++ b/docs/Envelope-Explorer-User-Guide.docx
@@ -352,7 +352,7 @@
           <w:i w:val="0"/>
           <w:sz w:val="19"/>
         </w:rPr>
-        <w:t>7  Roles and redaction</w:t>
+        <w:t>7  The execution trace: what a model actually used</w:t>
       </w:r>
     </w:p>
     <w:p>
@@ -362,7 +362,7 @@
           <w:i w:val="0"/>
           <w:sz w:val="19"/>
         </w:rPr>
-        <w:t>8  Three worked examples</w:t>
+        <w:t>8  Roles and redaction</w:t>
       </w:r>
     </w:p>
     <w:p>
@@ -372,7 +372,7 @@
           <w:i w:val="0"/>
           <w:sz w:val="19"/>
         </w:rPr>
-        <w:t>9  Keyboard and quick reference</w:t>
+        <w:t>9  Three worked examples</w:t>
       </w:r>
     </w:p>
     <w:p>
@@ -382,7 +382,17 @@
           <w:i w:val="0"/>
           <w:sz w:val="19"/>
         </w:rPr>
-        <w:t>10  Troubleshooting</w:t>
+        <w:t>10  Keyboard and quick reference</w:t>
+      </w:r>
+    </w:p>
+    <w:p>
+      <w:r>
+        <w:rPr>
+          <w:b w:val="0"/>
+          <w:i w:val="0"/>
+          <w:sz w:val="19"/>
+        </w:rPr>
+        <w:t>11  Troubleshooting</w:t>
       </w:r>
     </w:p>
     <w:p>
@@ -3057,7 +3067,7 @@
         <w:pStyle w:val="Heading1"/>
       </w:pPr>
       <w:r>
-        <w:t>7  Roles and redaction</w:t>
+        <w:t>7  The execution trace: what a model actually used</w:t>
       </w:r>
     </w:p>
     <w:p>
@@ -3066,7 +3076,7 @@
           <w:b w:val="0"/>
           <w:i w:val="0"/>
         </w:rPr>
-        <w:t>The 'viewing as' selector in the header changes what you are allowed to see. It is a real filter applied on the server, not a cosmetic setting.</w:t>
+        <w:t>The journey answers 'how does traffic flow'. The execution trace answers a narrower and more useful question: for this one fill, which raw envelopes did the model read, in what order, and how old were they when it acted?</w:t>
       </w:r>
     </w:p>
     <w:p>
@@ -3085,7 +3095,7 @@
               <a:graphicData uri="http://schemas.openxmlformats.org/drawingml/2006/picture">
                 <pic:pic>
                   <pic:nvPicPr>
-                    <pic:cNvPr id="0" name="g6-redaction.png"/>
+                    <pic:cNvPr id="0" name="g10-execution.png"/>
                     <pic:cNvPicPr/>
                   </pic:nvPicPr>
                   <pic:blipFill>
@@ -3116,7 +3126,425 @@
           <w:color w:val="596370"/>
           <w:sz w:val="16"/>
         </w:rPr>
-        <w:t>Figure 9 — the same envelope viewed as a bystander: depth fields removed, and a red band naming exactly what was withheld.</w:t>
+        <w:t>Figure 9 — the execution trace for one model.fill: lanes by stage, nodes placed in time, the dashed line marking the moment of execution, and the inputs listed beneath with the age each had when the model acted.</w:t>
+      </w:r>
+    </w:p>
+    <w:p>
+      <w:pPr>
+        <w:pStyle w:val="Heading2"/>
+      </w:pPr>
+      <w:r>
+        <w:t>7.1  How to read it</w:t>
+      </w:r>
+    </w:p>
+    <w:tbl>
+      <w:tblPr>
+        <w:tblStyle w:val="LightGrid-Accent1"/>
+        <w:tblW w:type="auto" w:w="0"/>
+        <w:jc w:val="center"/>
+        <w:tblLook w:firstColumn="1" w:firstRow="1" w:lastColumn="0" w:lastRow="0" w:noHBand="0" w:noVBand="1" w:val="04A0"/>
+      </w:tblPr>
+      <w:tblGrid>
+        <w:gridCol w:w="4873"/>
+        <w:gridCol w:w="4873"/>
+      </w:tblGrid>
+      <w:tr>
+        <w:tc>
+          <w:tcPr>
+            <w:tcW w:type="dxa" w:w="2160"/>
+          </w:tcPr>
+          <w:p>
+            <w:r/>
+            <w:r>
+              <w:rPr>
+                <w:b/>
+                <w:sz w:val="18"/>
+              </w:rPr>
+              <w:t>Element</w:t>
+            </w:r>
+          </w:p>
+        </w:tc>
+        <w:tc>
+          <w:tcPr>
+            <w:tcW w:type="dxa" w:w="7344"/>
+          </w:tcPr>
+          <w:p>
+            <w:r/>
+            <w:r>
+              <w:rPr>
+                <w:b/>
+                <w:sz w:val="18"/>
+              </w:rPr>
+              <w:t>Meaning</w:t>
+            </w:r>
+          </w:p>
+        </w:tc>
+      </w:tr>
+      <w:tr>
+        <w:tc>
+          <w:tcPr>
+            <w:tcW w:type="dxa" w:w="2160"/>
+          </w:tcPr>
+          <w:p>
+            <w:r/>
+            <w:r>
+              <w:rPr>
+                <w:sz w:val="17"/>
+              </w:rPr>
+              <w:t>Lanes</w:t>
+            </w:r>
+          </w:p>
+        </w:tc>
+        <w:tc>
+          <w:tcPr>
+            <w:tcW w:type="dxa" w:w="7344"/>
+          </w:tcPr>
+          <w:p>
+            <w:r/>
+            <w:r>
+              <w:rPr>
+                <w:sz w:val="17"/>
+              </w:rPr>
+              <w:t>one row per stage: market, advisories, risk, model, other</w:t>
+            </w:r>
+          </w:p>
+        </w:tc>
+      </w:tr>
+      <w:tr>
+        <w:tc>
+          <w:tcPr>
+            <w:tcW w:type="dxa" w:w="2160"/>
+          </w:tcPr>
+          <w:p>
+            <w:r/>
+            <w:r>
+              <w:rPr>
+                <w:sz w:val="17"/>
+              </w:rPr>
+              <w:t>Node</w:t>
+            </w:r>
+          </w:p>
+        </w:tc>
+        <w:tc>
+          <w:tcPr>
+            <w:tcW w:type="dxa" w:w="7344"/>
+          </w:tcPr>
+          <w:p>
+            <w:r/>
+            <w:r>
+              <w:rPr>
+                <w:sz w:val="17"/>
+              </w:rPr>
+              <w:t>one envelope. The label is the topic and how old it was at execution (−1s means one second before the fill)</w:t>
+            </w:r>
+          </w:p>
+        </w:tc>
+      </w:tr>
+      <w:tr>
+        <w:tc>
+          <w:tcPr>
+            <w:tcW w:type="dxa" w:w="2160"/>
+          </w:tcPr>
+          <w:p>
+            <w:r/>
+            <w:r>
+              <w:rPr>
+                <w:sz w:val="17"/>
+              </w:rPr>
+              <w:t>Dashed vertical line</w:t>
+            </w:r>
+          </w:p>
+        </w:tc>
+        <w:tc>
+          <w:tcPr>
+            <w:tcW w:type="dxa" w:w="7344"/>
+          </w:tcPr>
+          <w:p>
+            <w:r/>
+            <w:r>
+              <w:rPr>
+                <w:sz w:val="17"/>
+              </w:rPr>
+              <w:t>the moment of execution — the anchor envelope</w:t>
+            </w:r>
+          </w:p>
+        </w:tc>
+      </w:tr>
+      <w:tr>
+        <w:tc>
+          <w:tcPr>
+            <w:tcW w:type="dxa" w:w="2160"/>
+          </w:tcPr>
+          <w:p>
+            <w:r/>
+            <w:r>
+              <w:rPr>
+                <w:sz w:val="17"/>
+              </w:rPr>
+              <w:t>Dotted path</w:t>
+            </w:r>
+          </w:p>
+        </w:tc>
+        <w:tc>
+          <w:tcPr>
+            <w:tcW w:type="dxa" w:w="7344"/>
+          </w:tcPr>
+          <w:p>
+            <w:r/>
+            <w:r>
+              <w:rPr>
+                <w:sz w:val="17"/>
+              </w:rPr>
+              <w:t>the reading order: stage by stage through the chosen envelopes</w:t>
+            </w:r>
+          </w:p>
+        </w:tc>
+      </w:tr>
+      <w:tr>
+        <w:tc>
+          <w:tcPr>
+            <w:tcW w:type="dxa" w:w="2160"/>
+          </w:tcPr>
+          <w:p>
+            <w:r/>
+            <w:r>
+              <w:rPr>
+                <w:sz w:val="17"/>
+              </w:rPr>
+              <w:t>1× / 2× / 4×</w:t>
+            </w:r>
+          </w:p>
+        </w:tc>
+        <w:tc>
+          <w:tcPr>
+            <w:tcW w:type="dxa" w:w="7344"/>
+          </w:tcPr>
+          <w:p>
+            <w:r/>
+            <w:r>
+              <w:rPr>
+                <w:sz w:val="17"/>
+              </w:rPr>
+              <w:t>zoom. The canvas scrolls horizontally, so a fifteen-minute window stays readable</w:t>
+            </w:r>
+          </w:p>
+        </w:tc>
+      </w:tr>
+      <w:tr>
+        <w:tc>
+          <w:tcPr>
+            <w:tcW w:type="dxa" w:w="2160"/>
+          </w:tcPr>
+          <w:p>
+            <w:r/>
+            <w:r>
+              <w:rPr>
+                <w:sz w:val="17"/>
+              </w:rPr>
+              <w:t>Table beneath</w:t>
+            </w:r>
+          </w:p>
+        </w:tc>
+        <w:tc>
+          <w:tcPr>
+            <w:tcW w:type="dxa" w:w="7344"/>
+          </w:tcPr>
+          <w:p>
+            <w:r/>
+            <w:r>
+              <w:rPr>
+                <w:sz w:val="17"/>
+              </w:rPr>
+              <w:t>the inputs the anchor used: stage, topic, producer, age at execution, bytes</w:t>
+            </w:r>
+          </w:p>
+        </w:tc>
+      </w:tr>
+    </w:tbl>
+    <w:p>
+      <w:pPr>
+        <w:spacing w:after="40"/>
+      </w:pPr>
+    </w:p>
+    <w:p>
+      <w:pPr>
+        <w:pStyle w:val="Heading2"/>
+      </w:pPr>
+      <w:r>
+        <w:t>7.2  Working through an execution</w:t>
+      </w:r>
+    </w:p>
+    <w:p>
+      <w:pPr>
+        <w:ind w:left="360" w:hanging="360"/>
+      </w:pPr>
+      <w:r>
+        <w:rPr>
+          <w:b/>
+        </w:rPr>
+        <w:t xml:space="preserve">1.  </w:t>
+      </w:r>
+      <w:r>
+        <w:t>Open the EXECUTION tab with a fill selected (filter topic = model.fill to find one).</w:t>
+      </w:r>
+    </w:p>
+    <w:p>
+      <w:pPr>
+        <w:ind w:left="360" w:hanging="360"/>
+      </w:pPr>
+      <w:r>
+        <w:rPr>
+          <w:b/>
+        </w:rPr>
+        <w:t xml:space="preserve">2.  </w:t>
+      </w:r>
+      <w:r>
+        <w:t>The view scrolls itself to the moment of execution and marks it with a dashed line.</w:t>
+      </w:r>
+    </w:p>
+    <w:p>
+      <w:pPr>
+        <w:ind w:left="360" w:hanging="360"/>
+      </w:pPr>
+      <w:r>
+        <w:rPr>
+          <w:b/>
+        </w:rPr>
+        <w:t xml:space="preserve">3.  </w:t>
+      </w:r>
+      <w:r>
+        <w:t>Read left to right: market data first, then the advisories, then anything that followed the fill.</w:t>
+      </w:r>
+    </w:p>
+    <w:p>
+      <w:pPr>
+        <w:ind w:left="360" w:hanging="360"/>
+      </w:pPr>
+      <w:r>
+        <w:rPr>
+          <w:b/>
+        </w:rPr>
+        <w:t xml:space="preserve">4.  </w:t>
+      </w:r>
+      <w:r>
+        <w:t>Click any node to see its raw envelope in the right-hand pane — data, meta and references.</w:t>
+      </w:r>
+    </w:p>
+    <w:p>
+      <w:pPr>
+        <w:ind w:left="360" w:hanging="360"/>
+      </w:pPr>
+      <w:r>
+        <w:rPr>
+          <w:b/>
+        </w:rPr>
+        <w:t xml:space="preserve">5.  </w:t>
+      </w:r>
+      <w:r>
+        <w:t>Use the table beneath to compare ages: a decision made on a 600-second-old candle is a different decision from one made on a 2-second-old candle.</w:t>
+      </w:r>
+    </w:p>
+    <w:tbl>
+      <w:tblPr>
+        <w:tblStyle w:val="LightList-Accent1"/>
+        <w:tblW w:type="auto" w:w="0"/>
+        <w:tblLook w:firstColumn="1" w:firstRow="1" w:lastColumn="0" w:lastRow="0" w:noHBand="0" w:noVBand="1" w:val="04A0"/>
+      </w:tblPr>
+      <w:tblGrid>
+        <w:gridCol w:w="9746"/>
+      </w:tblGrid>
+      <w:tr>
+        <w:tc>
+          <w:tcPr>
+            <w:tcW w:type="dxa" w:w="9746"/>
+          </w:tcPr>
+          <w:p>
+            <w:r/>
+            <w:r>
+              <w:rPr>
+                <w:sz w:val="18"/>
+              </w:rPr>
+              <w:t>This is the view for 'why did the model do that'. It shows the exact envelopes, their ages, and their producers — not a summary of them. When books start emitting references, the dotted path becomes literal lineage instead of a time-ordered reading of the window.</w:t>
+            </w:r>
+          </w:p>
+        </w:tc>
+      </w:tr>
+    </w:tbl>
+    <w:p>
+      <w:pPr>
+        <w:spacing w:after="40"/>
+      </w:pPr>
+    </w:p>
+    <w:p>
+      <w:r>
+        <w:br w:type="page"/>
+      </w:r>
+    </w:p>
+    <w:p>
+      <w:pPr>
+        <w:pStyle w:val="Heading1"/>
+      </w:pPr>
+      <w:r>
+        <w:t>8  Roles and redaction</w:t>
+      </w:r>
+    </w:p>
+    <w:p>
+      <w:r>
+        <w:rPr>
+          <w:b w:val="0"/>
+          <w:i w:val="0"/>
+        </w:rPr>
+        <w:t>The 'viewing as' selector in the header changes what you are allowed to see. It is a real filter applied on the server, not a cosmetic setting.</w:t>
+      </w:r>
+    </w:p>
+    <w:p>
+      <w:pPr>
+        <w:jc w:val="center"/>
+      </w:pPr>
+      <w:r>
+        <w:drawing>
+          <wp:inline xmlns:a="http://schemas.openxmlformats.org/drawingml/2006/main" xmlns:pic="http://schemas.openxmlformats.org/drawingml/2006/picture">
+            <wp:extent cx="6188400" cy="3683571"/>
+            <wp:docPr id="10" name="Picture 10"/>
+            <wp:cNvGraphicFramePr>
+              <a:graphicFrameLocks noChangeAspect="1"/>
+            </wp:cNvGraphicFramePr>
+            <a:graphic>
+              <a:graphicData uri="http://schemas.openxmlformats.org/drawingml/2006/picture">
+                <pic:pic>
+                  <pic:nvPicPr>
+                    <pic:cNvPr id="0" name="g6-redaction.png"/>
+                    <pic:cNvPicPr/>
+                  </pic:nvPicPr>
+                  <pic:blipFill>
+                    <a:blip r:embed="rId18"/>
+                    <a:stretch>
+                      <a:fillRect/>
+                    </a:stretch>
+                  </pic:blipFill>
+                  <pic:spPr>
+                    <a:xfrm>
+                      <a:off x="0" y="0"/>
+                      <a:ext cx="6188400" cy="3683571"/>
+                    </a:xfrm>
+                    <a:prstGeom prst="rect"/>
+                  </pic:spPr>
+                </pic:pic>
+              </a:graphicData>
+            </a:graphic>
+          </wp:inline>
+        </w:drawing>
+      </w:r>
+    </w:p>
+    <w:p>
+      <w:r>
+        <w:rPr>
+          <w:b w:val="0"/>
+          <w:i/>
+          <w:color w:val="596370"/>
+          <w:sz w:val="16"/>
+        </w:rPr>
+        <w:t>Figure 10 — the same envelope viewed as a bystander: depth fields removed, and a red band naming exactly what was withheld.</w:t>
       </w:r>
     </w:p>
     <w:tbl>
@@ -3330,7 +3758,7 @@
         <w:pStyle w:val="Heading1"/>
       </w:pPr>
       <w:r>
-        <w:t>8  Three worked examples</w:t>
+        <w:t>9  Three worked examples</w:t>
       </w:r>
     </w:p>
     <w:p>
@@ -3338,7 +3766,7 @@
         <w:pStyle w:val="Heading2"/>
       </w:pPr>
       <w:r>
-        <w:t>8.1  Why did we buy this?</w:t>
+        <w:t>9.1  Why did we buy this?</w:t>
       </w:r>
     </w:p>
     <w:p>
@@ -3402,7 +3830,7 @@
         <w:pStyle w:val="Heading2"/>
       </w:pPr>
       <w:r>
-        <w:t>8.2  What happened at a specific minute?</w:t>
+        <w:t>9.2  What happened at a specific minute?</w:t>
       </w:r>
     </w:p>
     <w:p>
@@ -3452,7 +3880,7 @@
         <w:pStyle w:val="Heading2"/>
       </w:pPr>
       <w:r>
-        <w:t>8.3  Which model is producing decisions?</w:t>
+        <w:t>9.3  Which model is producing decisions?</w:t>
       </w:r>
     </w:p>
     <w:p>
@@ -3507,7 +3935,7 @@
         <w:pStyle w:val="Heading1"/>
       </w:pPr>
       <w:r>
-        <w:t>9  Keyboard and quick reference</w:t>
+        <w:t>10  Keyboard and quick reference</w:t>
       </w:r>
     </w:p>
     <w:tbl>
@@ -3714,7 +4142,7 @@
         <w:pStyle w:val="Heading2"/>
       </w:pPr>
       <w:r>
-        <w:t>9.1  What the colours mean</w:t>
+        <w:t>10.1  What the colours mean</w:t>
       </w:r>
     </w:p>
     <w:tbl>
@@ -4007,7 +4435,7 @@
         <w:pStyle w:val="Heading1"/>
       </w:pPr>
       <w:r>
-        <w:t>10  Troubleshooting</w:t>
+        <w:t>11  Troubleshooting</w:t>
       </w:r>
     </w:p>
     <w:tbl>
@@ -4371,7 +4799,7 @@
       </w:pPr>
     </w:p>
     <w:sectPr>
-      <w:footerReference w:type="default" r:id="rId18"/>
+      <w:footerReference w:type="default" r:id="rId19"/>
       <w:pgSz w:w="11906" w:h="16838"/>
       <w:pgMar w:top="1008" w:right="1080" w:bottom="1008" w:left="1080" w:header="720" w:footer="720" w:gutter="0"/>
       <w:cols w:space="720"/>

</xml_diff>